<commit_message>
Updated Template for Accomplishment Report. Here are the changes: - Removed top right header text. - Removed ISO logo.
</commit_message>
<xml_diff>
--- a/storage/assets/TEMPLATE - Accomplishment-Report.docx
+++ b/storage/assets/TEMPLATE - Accomplishment-Report.docx
@@ -2318,54 +2318,6 @@
       </w:rPr>
       <w:t>1</w:t>
     </w:r>
-    <w:r>
-      <w:rPr>
-        <w:noProof/>
-      </w:rPr>
-      <w:drawing>
-        <wp:anchor distT="0" distB="0" distL="114300" distR="114300" simplePos="0" relativeHeight="251659264" behindDoc="0" locked="0" layoutInCell="1" hidden="0" allowOverlap="1" wp14:anchorId="7E2B8DD2" wp14:editId="67ECB8AF">
-          <wp:simplePos x="0" y="0"/>
-          <wp:positionH relativeFrom="column">
-            <wp:posOffset>5012055</wp:posOffset>
-          </wp:positionH>
-          <wp:positionV relativeFrom="paragraph">
-            <wp:posOffset>88265</wp:posOffset>
-          </wp:positionV>
-          <wp:extent cx="719455" cy="449580"/>
-          <wp:effectExtent l="0" t="0" r="0" b="0"/>
-          <wp:wrapSquare wrapText="bothSides" distT="0" distB="0" distL="114300" distR="114300"/>
-          <wp:docPr id="85" name="image1.jpg"/>
-          <wp:cNvGraphicFramePr/>
-          <a:graphic xmlns:a="http://schemas.openxmlformats.org/drawingml/2006/main">
-            <a:graphicData uri="http://schemas.openxmlformats.org/drawingml/2006/picture">
-              <pic:pic xmlns:pic="http://schemas.openxmlformats.org/drawingml/2006/picture">
-                <pic:nvPicPr>
-                  <pic:cNvPr id="0" name="image1.jpg"/>
-                  <pic:cNvPicPr preferRelativeResize="0"/>
-                </pic:nvPicPr>
-                <pic:blipFill>
-                  <a:blip r:embed="rId1"/>
-                  <a:srcRect/>
-                  <a:stretch>
-                    <a:fillRect/>
-                  </a:stretch>
-                </pic:blipFill>
-                <pic:spPr>
-                  <a:xfrm>
-                    <a:off x="0" y="0"/>
-                    <a:ext cx="719455" cy="449580"/>
-                  </a:xfrm>
-                  <a:prstGeom prst="rect">
-                    <a:avLst/>
-                  </a:prstGeom>
-                  <a:ln/>
-                </pic:spPr>
-              </pic:pic>
-            </a:graphicData>
-          </a:graphic>
-        </wp:anchor>
-      </w:drawing>
-    </w:r>
   </w:p>
   <w:p>
     <w:pPr>
@@ -2398,7 +2350,7 @@
       <w:br/>
       <w:t xml:space="preserve">Website: </w:t>
     </w:r>
-    <w:hyperlink r:id="rId2">
+    <w:hyperlink r:id="rId1">
       <w:r>
         <w:rPr>
           <w:rFonts w:ascii="Times New Roman" w:eastAsia="Times New Roman" w:hAnsi="Times New Roman" w:cs="Times New Roman"/>
@@ -2541,7 +2493,6 @@
       </w:pBdr>
       <w:spacing w:after="0" w:line="240" w:lineRule="auto"/>
       <w:ind w:firstLine="0"/>
-      <w:jc w:val="right"/>
       <w:rPr>
         <w:rFonts w:ascii="Times New Roman" w:eastAsia="Times New Roman" w:hAnsi="Times New Roman" w:cs="Times New Roman"/>
         <w:color w:val="000000"/>
@@ -2549,54 +2500,6 @@
         <w:szCs w:val="16"/>
       </w:rPr>
     </w:pPr>
-    <w:r>
-      <w:rPr>
-        <w:rFonts w:ascii="Times New Roman" w:eastAsia="Times New Roman" w:hAnsi="Times New Roman" w:cs="Times New Roman"/>
-        <w:i/>
-        <w:color w:val="000000"/>
-        <w:sz w:val="16"/>
-        <w:szCs w:val="16"/>
-      </w:rPr>
-      <w:t>DSWD-GF-010A</w:t>
-    </w:r>
-    <w:r>
-      <w:rPr>
-        <w:rFonts w:ascii="Times New Roman" w:eastAsia="Times New Roman" w:hAnsi="Times New Roman" w:cs="Times New Roman"/>
-        <w:color w:val="000000"/>
-        <w:sz w:val="16"/>
-        <w:szCs w:val="16"/>
-      </w:rPr>
-      <w:t xml:space="preserve"> | </w:t>
-    </w:r>
-    <w:r>
-      <w:rPr>
-        <w:rFonts w:ascii="Times New Roman" w:eastAsia="Times New Roman" w:hAnsi="Times New Roman" w:cs="Times New Roman"/>
-        <w:i/>
-        <w:color w:val="000000"/>
-        <w:sz w:val="16"/>
-        <w:szCs w:val="16"/>
-      </w:rPr>
-      <w:t>REV 0</w:t>
-    </w:r>
-    <w:r>
-      <w:rPr>
-        <w:rFonts w:ascii="Times New Roman" w:eastAsia="Times New Roman" w:hAnsi="Times New Roman" w:cs="Times New Roman"/>
-        <w:i/>
-        <w:sz w:val="16"/>
-        <w:szCs w:val="16"/>
-      </w:rPr>
-      <w:t>0</w:t>
-    </w:r>
-    <w:r>
-      <w:rPr>
-        <w:rFonts w:ascii="Times New Roman" w:eastAsia="Times New Roman" w:hAnsi="Times New Roman" w:cs="Times New Roman"/>
-        <w:i/>
-        <w:color w:val="000000"/>
-        <w:sz w:val="16"/>
-        <w:szCs w:val="16"/>
-      </w:rPr>
-      <w:t xml:space="preserve"> | 22 SEP 2023</w:t>
-    </w:r>
   </w:p>
 </w:hdr>
 </file>

</xml_diff>

<commit_message>
AR TEmpalte & Unit Testing Resolved
</commit_message>
<xml_diff>
--- a/storage/assets/TEMPLATE - Accomplishment-Report.docx
+++ b/storage/assets/TEMPLATE - Accomplishment-Report.docx
@@ -133,16 +133,8 @@
     </w:p>
     <w:tbl>
       <w:tblPr>
-        <w:tblStyle w:val="a7"/>
+        <w:tblStyle w:val="TableGrid"/>
         <w:tblW w:w="9175" w:type="dxa"/>
-        <w:tblBorders>
-          <w:top w:val="single" w:sz="4" w:space="0" w:color="000000"/>
-          <w:left w:val="single" w:sz="4" w:space="0" w:color="000000"/>
-          <w:bottom w:val="single" w:sz="4" w:space="0" w:color="000000"/>
-          <w:right w:val="single" w:sz="4" w:space="0" w:color="000000"/>
-          <w:insideH w:val="single" w:sz="4" w:space="0" w:color="000000"/>
-          <w:insideV w:val="single" w:sz="4" w:space="0" w:color="000000"/>
-        </w:tblBorders>
         <w:tblLayout w:type="fixed"/>
         <w:tblLook w:val="0400" w:firstRow="0" w:lastRow="0" w:firstColumn="0" w:lastColumn="0" w:noHBand="0" w:noVBand="1"/>
       </w:tblPr>
@@ -161,10 +153,10 @@
           <w:tcPr>
             <w:tcW w:w="1667" w:type="dxa"/>
             <w:vMerge w:val="restart"/>
-            <w:vAlign w:val="center"/>
           </w:tcPr>
           <w:p>
             <w:pPr>
+              <w:spacing w:before="240"/>
               <w:ind w:firstLine="0"/>
               <w:jc w:val="center"/>
               <w:rPr>
@@ -188,10 +180,10 @@
         <w:tc>
           <w:tcPr>
             <w:tcW w:w="2663" w:type="dxa"/>
-            <w:vAlign w:val="center"/>
           </w:tcPr>
           <w:p>
             <w:pPr>
+              <w:spacing w:before="120"/>
               <w:ind w:firstLine="0"/>
               <w:jc w:val="center"/>
               <w:rPr>
@@ -241,10 +233,10 @@
           <w:tcPr>
             <w:tcW w:w="2505" w:type="dxa"/>
             <w:gridSpan w:val="2"/>
-            <w:vAlign w:val="center"/>
           </w:tcPr>
           <w:p>
             <w:pPr>
+              <w:spacing w:before="120"/>
               <w:ind w:firstLine="0"/>
               <w:jc w:val="center"/>
               <w:rPr>
@@ -296,6 +288,7 @@
           </w:tcPr>
           <w:p>
             <w:pPr>
+              <w:spacing w:before="120"/>
               <w:ind w:firstLine="0"/>
               <w:jc w:val="center"/>
               <w:rPr>
@@ -347,7 +340,6 @@
           <w:tcPr>
             <w:tcW w:w="1667" w:type="dxa"/>
             <w:vMerge/>
-            <w:vAlign w:val="center"/>
           </w:tcPr>
           <w:p>
             <w:pPr>
@@ -359,7 +351,7 @@
                 <w:right w:val="nil"/>
                 <w:between w:val="nil"/>
               </w:pBdr>
-              <w:spacing w:after="0" w:line="276" w:lineRule="auto"/>
+              <w:spacing w:line="276" w:lineRule="auto"/>
               <w:ind w:firstLine="0"/>
               <w:rPr>
                 <w:rFonts w:ascii="Arial" w:eastAsia="Arial" w:hAnsi="Arial" w:cs="Arial"/>
@@ -373,7 +365,6 @@
         <w:tc>
           <w:tcPr>
             <w:tcW w:w="2663" w:type="dxa"/>
-            <w:vAlign w:val="center"/>
           </w:tcPr>
           <w:p>
             <w:pPr>
@@ -405,7 +396,6 @@
           <w:tcPr>
             <w:tcW w:w="2505" w:type="dxa"/>
             <w:gridSpan w:val="2"/>
-            <w:vAlign w:val="center"/>
           </w:tcPr>
           <w:p>
             <w:pPr>
@@ -471,10 +461,10 @@
         <w:tc>
           <w:tcPr>
             <w:tcW w:w="1667" w:type="dxa"/>
-            <w:vAlign w:val="center"/>
           </w:tcPr>
           <w:p>
             <w:pPr>
+              <w:spacing w:before="120"/>
               <w:ind w:firstLine="0"/>
               <w:jc w:val="center"/>
               <w:rPr>
@@ -498,10 +488,10 @@
         <w:tc>
           <w:tcPr>
             <w:tcW w:w="2663" w:type="dxa"/>
-            <w:vAlign w:val="center"/>
           </w:tcPr>
           <w:p>
             <w:pPr>
+              <w:spacing w:before="120"/>
               <w:ind w:firstLine="0"/>
               <w:jc w:val="center"/>
               <w:rPr>
@@ -548,10 +538,10 @@
           <w:tcPr>
             <w:tcW w:w="2505" w:type="dxa"/>
             <w:gridSpan w:val="2"/>
-            <w:vAlign w:val="center"/>
           </w:tcPr>
           <w:p>
             <w:pPr>
+              <w:spacing w:before="120"/>
               <w:ind w:firstLine="0"/>
               <w:jc w:val="center"/>
               <w:rPr>
@@ -578,6 +568,7 @@
           </w:tcPr>
           <w:p>
             <w:pPr>
+              <w:spacing w:before="120"/>
               <w:ind w:firstLine="0"/>
               <w:jc w:val="center"/>
               <w:rPr>
@@ -624,10 +615,10 @@
         <w:tc>
           <w:tcPr>
             <w:tcW w:w="1667" w:type="dxa"/>
-            <w:vAlign w:val="center"/>
           </w:tcPr>
           <w:p>
             <w:pPr>
+              <w:spacing w:before="120"/>
               <w:ind w:firstLine="0"/>
               <w:jc w:val="center"/>
               <w:rPr>
@@ -655,6 +646,7 @@
           </w:tcPr>
           <w:p>
             <w:pPr>
+              <w:spacing w:before="120"/>
               <w:ind w:firstLine="0"/>
               <w:jc w:val="center"/>
               <w:rPr>
@@ -707,10 +699,10 @@
         <w:tc>
           <w:tcPr>
             <w:tcW w:w="1667" w:type="dxa"/>
-            <w:vAlign w:val="center"/>
           </w:tcPr>
           <w:p>
             <w:pPr>
+              <w:spacing w:before="120"/>
               <w:ind w:firstLine="0"/>
               <w:jc w:val="center"/>
               <w:rPr>
@@ -735,10 +727,10 @@
           <w:tcPr>
             <w:tcW w:w="4088" w:type="dxa"/>
             <w:gridSpan w:val="2"/>
-            <w:vAlign w:val="center"/>
           </w:tcPr>
           <w:p>
             <w:pPr>
+              <w:spacing w:before="120"/>
               <w:ind w:firstLine="0"/>
               <w:jc w:val="center"/>
               <w:rPr>
@@ -763,10 +755,10 @@
           <w:tcPr>
             <w:tcW w:w="3420" w:type="dxa"/>
             <w:gridSpan w:val="2"/>
-            <w:vAlign w:val="center"/>
           </w:tcPr>
           <w:p>
             <w:pPr>
+              <w:spacing w:before="120"/>
               <w:ind w:firstLine="0"/>
               <w:jc w:val="center"/>
               <w:rPr>
@@ -790,12 +782,11 @@
       </w:tr>
       <w:tr>
         <w:trPr>
-          <w:trHeight w:val="720"/>
+          <w:trHeight w:val="1527"/>
         </w:trPr>
         <w:tc>
           <w:tcPr>
             <w:tcW w:w="1667" w:type="dxa"/>
-            <w:vAlign w:val="center"/>
           </w:tcPr>
           <w:p>
             <w:pPr>
@@ -805,45 +796,47 @@
                 <w:b/>
               </w:rPr>
             </w:pPr>
-            <w:r>
-              <w:rPr>
-                <w:rFonts w:ascii="Arial" w:eastAsia="Arial" w:hAnsi="Arial" w:cs="Arial"/>
-                <w:b/>
-              </w:rPr>
-              <w:t>$</w:t>
-            </w:r>
-            <w:r>
-              <w:rPr>
-                <w:rFonts w:ascii="Arial" w:eastAsia="Arial" w:hAnsi="Arial" w:cs="Arial"/>
-                <w:b/>
-              </w:rPr>
-              <w:t>{</w:t>
-            </w:r>
-            <w:proofErr w:type="spellStart"/>
-            <w:r>
-              <w:rPr>
-                <w:rFonts w:ascii="Arial" w:eastAsia="Arial" w:hAnsi="Arial" w:cs="Arial"/>
-                <w:b/>
-              </w:rPr>
-              <w:t>weekNum</w:t>
-            </w:r>
-            <w:proofErr w:type="spellEnd"/>
-            <w:r>
-              <w:rPr>
-                <w:rFonts w:ascii="Arial" w:eastAsia="Arial" w:hAnsi="Arial" w:cs="Arial"/>
-                <w:b/>
-              </w:rPr>
-              <w:t>}</w:t>
-            </w:r>
           </w:p>
           <w:p>
             <w:pPr>
+              <w:spacing w:before="240"/>
+              <w:ind w:firstLine="0"/>
               <w:jc w:val="center"/>
               <w:rPr>
                 <w:rFonts w:ascii="Arial" w:eastAsia="Arial" w:hAnsi="Arial" w:cs="Arial"/>
                 <w:b/>
               </w:rPr>
             </w:pPr>
+            <w:r>
+              <w:rPr>
+                <w:rFonts w:ascii="Arial" w:eastAsia="Arial" w:hAnsi="Arial" w:cs="Arial"/>
+                <w:b/>
+              </w:rPr>
+              <w:t>$</w:t>
+            </w:r>
+            <w:r>
+              <w:rPr>
+                <w:rFonts w:ascii="Arial" w:eastAsia="Arial" w:hAnsi="Arial" w:cs="Arial"/>
+                <w:b/>
+              </w:rPr>
+              <w:t>{</w:t>
+            </w:r>
+            <w:proofErr w:type="spellStart"/>
+            <w:r>
+              <w:rPr>
+                <w:rFonts w:ascii="Arial" w:eastAsia="Arial" w:hAnsi="Arial" w:cs="Arial"/>
+                <w:b/>
+              </w:rPr>
+              <w:t>weekNum</w:t>
+            </w:r>
+            <w:proofErr w:type="spellEnd"/>
+            <w:r>
+              <w:rPr>
+                <w:rFonts w:ascii="Arial" w:eastAsia="Arial" w:hAnsi="Arial" w:cs="Arial"/>
+                <w:b/>
+              </w:rPr>
+              <w:t>}</w:t>
+            </w:r>
           </w:p>
           <w:p>
             <w:pPr>
@@ -889,7 +882,6 @@
           <w:tcPr>
             <w:tcW w:w="4088" w:type="dxa"/>
             <w:gridSpan w:val="2"/>
-            <w:vAlign w:val="center"/>
           </w:tcPr>
           <w:p>
             <w:pPr>
@@ -900,37 +892,11 @@
                 <w:right w:val="nil"/>
                 <w:between w:val="nil"/>
               </w:pBdr>
-              <w:ind w:left="384" w:firstLine="0"/>
-              <w:rPr>
-                <w:rFonts w:ascii="Arial" w:eastAsia="Arial" w:hAnsi="Arial" w:cs="Arial"/>
-                <w:color w:val="000000"/>
-                <w:highlight w:val="white"/>
+              <w:ind w:firstLine="0"/>
+              <w:rPr>
+                <w:rFonts w:ascii="Arial" w:eastAsia="Arial" w:hAnsi="Arial" w:cs="Arial"/>
               </w:rPr>
             </w:pPr>
-            <w:r>
-              <w:rPr>
-                <w:rFonts w:ascii="Arial" w:eastAsia="Arial" w:hAnsi="Arial" w:cs="Arial"/>
-              </w:rPr>
-              <w:t>$</w:t>
-            </w:r>
-            <w:r>
-              <w:rPr>
-                <w:rFonts w:ascii="Arial" w:eastAsia="Arial" w:hAnsi="Arial" w:cs="Arial"/>
-              </w:rPr>
-              <w:t>{</w:t>
-            </w:r>
-            <w:r>
-              <w:rPr>
-                <w:rFonts w:ascii="Arial" w:eastAsia="Arial" w:hAnsi="Arial" w:cs="Arial"/>
-              </w:rPr>
-              <w:t>activities</w:t>
-            </w:r>
-            <w:r>
-              <w:rPr>
-                <w:rFonts w:ascii="Arial" w:eastAsia="Arial" w:hAnsi="Arial" w:cs="Arial"/>
-              </w:rPr>
-              <w:t>}</w:t>
-            </w:r>
           </w:p>
           <w:p>
             <w:pPr>
@@ -944,6 +910,47 @@
               <w:ind w:firstLine="0"/>
               <w:rPr>
                 <w:rFonts w:ascii="Arial" w:eastAsia="Arial" w:hAnsi="Arial" w:cs="Arial"/>
+                <w:color w:val="000000"/>
+                <w:highlight w:val="white"/>
+              </w:rPr>
+            </w:pPr>
+            <w:r>
+              <w:rPr>
+                <w:rFonts w:ascii="Arial" w:eastAsia="Arial" w:hAnsi="Arial" w:cs="Arial"/>
+              </w:rPr>
+              <w:t>$</w:t>
+            </w:r>
+            <w:r>
+              <w:rPr>
+                <w:rFonts w:ascii="Arial" w:eastAsia="Arial" w:hAnsi="Arial" w:cs="Arial"/>
+              </w:rPr>
+              <w:t>{</w:t>
+            </w:r>
+            <w:r>
+              <w:rPr>
+                <w:rFonts w:ascii="Arial" w:eastAsia="Arial" w:hAnsi="Arial" w:cs="Arial"/>
+              </w:rPr>
+              <w:t>activities</w:t>
+            </w:r>
+            <w:r>
+              <w:rPr>
+                <w:rFonts w:ascii="Arial" w:eastAsia="Arial" w:hAnsi="Arial" w:cs="Arial"/>
+              </w:rPr>
+              <w:t>}</w:t>
+            </w:r>
+          </w:p>
+          <w:p>
+            <w:pPr>
+              <w:pBdr>
+                <w:top w:val="nil"/>
+                <w:left w:val="nil"/>
+                <w:bottom w:val="nil"/>
+                <w:right w:val="nil"/>
+                <w:between w:val="nil"/>
+              </w:pBdr>
+              <w:ind w:firstLine="0"/>
+              <w:rPr>
+                <w:rFonts w:ascii="Arial" w:eastAsia="Arial" w:hAnsi="Arial" w:cs="Arial"/>
                 <w:highlight w:val="white"/>
               </w:rPr>
             </w:pPr>
@@ -953,7 +960,6 @@
           <w:tcPr>
             <w:tcW w:w="3420" w:type="dxa"/>
             <w:gridSpan w:val="2"/>
-            <w:vAlign w:val="center"/>
           </w:tcPr>
           <w:p>
             <w:pPr>
@@ -971,6 +977,23 @@
                 <w:highlight w:val="white"/>
               </w:rPr>
             </w:pPr>
+          </w:p>
+          <w:p>
+            <w:pPr>
+              <w:pBdr>
+                <w:top w:val="nil"/>
+                <w:left w:val="nil"/>
+                <w:bottom w:val="nil"/>
+                <w:right w:val="nil"/>
+                <w:between w:val="nil"/>
+              </w:pBdr>
+              <w:ind w:firstLine="0"/>
+              <w:rPr>
+                <w:rFonts w:ascii="Arial" w:eastAsia="Arial" w:hAnsi="Arial" w:cs="Arial"/>
+                <w:color w:val="000000"/>
+                <w:highlight w:val="white"/>
+              </w:rPr>
+            </w:pPr>
             <w:r>
               <w:rPr>
                 <w:rFonts w:ascii="Arial" w:eastAsia="Arial" w:hAnsi="Arial" w:cs="Arial"/>
@@ -989,10 +1012,10 @@
         <w:tc>
           <w:tcPr>
             <w:tcW w:w="1667" w:type="dxa"/>
-            <w:vAlign w:val="center"/>
           </w:tcPr>
           <w:p>
             <w:pPr>
+              <w:spacing w:before="120"/>
               <w:jc w:val="center"/>
               <w:rPr>
                 <w:rFonts w:ascii="Arial" w:eastAsia="Arial" w:hAnsi="Arial" w:cs="Arial"/>
@@ -1015,6 +1038,7 @@
           </w:tcPr>
           <w:p>
             <w:pPr>
+              <w:spacing w:before="120"/>
               <w:ind w:firstLine="0"/>
               <w:jc w:val="center"/>
               <w:rPr>
@@ -1181,7 +1205,7 @@
       </w:tr>
       <w:tr>
         <w:trPr>
-          <w:trHeight w:val="953"/>
+          <w:trHeight w:val="425"/>
         </w:trPr>
         <w:tc>
           <w:tcPr>
@@ -1202,6 +1226,7 @@
           </w:tcPr>
           <w:p>
             <w:pPr>
+              <w:ind w:firstLine="0"/>
               <w:rPr>
                 <w:rFonts w:ascii="Arial" w:eastAsia="Arial" w:hAnsi="Arial" w:cs="Arial"/>
               </w:rPr>

</xml_diff>